<commit_message>
Wording: use report instead of scientific paper in flowchart
Made-by: Omar
</commit_message>
<xml_diff>
--- a/5004CMD_Project_Report.docx
+++ b/5004CMD_Project_Report.docx
@@ -2673,215 +2673,100 @@
     <w:p>
       <w:r>
         <w:t>Start</w:t>
-      </w:r>
-      <w:r>
         <w:br/>
         <w:t>↓</w:t>
-      </w:r>
-      <w:r>
         <w:br/>
-        <w:t xml:space="preserve">Load Trips_by_Distance.csv and </w:t>
-      </w:r>
-      <w:proofErr w:type="spellStart"/>
-      <w:r>
-        <w:t>Trips_Full</w:t>
-      </w:r>
-      <w:proofErr w:type="spellEnd"/>
-      <w:r>
-        <w:t xml:space="preserve"> Data.csv</w:t>
-      </w:r>
-      <w:r>
+        <w:t>Load Trips_by_Distance.csv and Trips_Full Data.csv</w:t>
         <w:br/>
         <w:t>↓</w:t>
-      </w:r>
-      <w:r>
         <w:br/>
         <w:t>Convert Date fields</w:t>
-      </w:r>
-      <w:r>
         <w:br/>
         <w:t>↓</w:t>
-      </w:r>
-      <w:r>
         <w:br/>
         <w:t>Filter National level rows</w:t>
-      </w:r>
-      <w:r>
         <w:br/>
         <w:t>↓</w:t>
-      </w:r>
-      <w:r>
         <w:br/>
         <w:t>Clean and remove irrelevant columns</w:t>
-      </w:r>
-      <w:r>
         <w:br/>
         <w:t>↓</w:t>
-      </w:r>
-      <w:r>
         <w:br/>
         <w:t>Question 1:</w:t>
-      </w:r>
-      <w:r>
         <w:br/>
         <w:t>Compute weekly home and non-home averages</w:t>
-      </w:r>
-      <w:r>
         <w:br/>
         <w:t>↓</w:t>
-      </w:r>
-      <w:r>
         <w:br/>
         <w:t>Create weekly bar charts</w:t>
-      </w:r>
-      <w:r>
         <w:br/>
         <w:t>↓</w:t>
-      </w:r>
-      <w:r>
         <w:br/>
         <w:t>Question 2:</w:t>
-      </w:r>
-      <w:r>
         <w:br/>
         <w:t>Filter dates above 10,000,000 for 10-25 and 50-100 trip ranges</w:t>
-      </w:r>
-      <w:r>
         <w:br/>
         <w:t>↓</w:t>
-      </w:r>
-      <w:r>
         <w:br/>
         <w:t>Create threshold comparison scatter plot</w:t>
-      </w:r>
-      <w:r>
         <w:br/>
         <w:t>↓</w:t>
-      </w:r>
-      <w:r>
         <w:br/>
         <w:t>Question 3:</w:t>
-      </w:r>
-      <w:r>
         <w:br/>
         <w:t>Align dates and train linear regression model</w:t>
-      </w:r>
-      <w:r>
         <w:br/>
         <w:t>↓</w:t>
-      </w:r>
-      <w:r>
         <w:br/>
         <w:t>Evaluate RMSE and R2</w:t>
-      </w:r>
-      <w:r>
         <w:br/>
         <w:t>↓</w:t>
-      </w:r>
-      <w:r>
         <w:br/>
         <w:t>Create regression figure</w:t>
-      </w:r>
-      <w:r>
         <w:br/>
         <w:t>↓</w:t>
-      </w:r>
-      <w:r>
         <w:br/>
         <w:t>Question 4:</w:t>
-      </w:r>
-      <w:r>
         <w:br/>
-      </w:r>
-      <w:r>
-        <w:lastRenderedPageBreak/>
-        <w:t xml:space="preserve">Compute average </w:t>
-      </w:r>
-      <w:proofErr w:type="spellStart"/>
-      <w:r>
-        <w:t>travellers</w:t>
-      </w:r>
-      <w:proofErr w:type="spellEnd"/>
-      <w:r>
-        <w:t xml:space="preserve"> by distance category</w:t>
-      </w:r>
-      <w:r>
+        <w:t>Compute average travellers by distance category</w:t>
         <w:br/>
         <w:t>↓</w:t>
-      </w:r>
-      <w:r>
         <w:br/>
         <w:t>Create distance-trip bar chart</w:t>
-      </w:r>
-      <w:r>
         <w:br/>
         <w:t>↓</w:t>
-      </w:r>
-      <w:r>
         <w:br/>
         <w:t>Run serial workflow</w:t>
-      </w:r>
-      <w:r>
         <w:br/>
         <w:t>↓</w:t>
-      </w:r>
-      <w:r>
         <w:br/>
         <w:t>Record time</w:t>
-      </w:r>
-      <w:r>
         <w:br/>
         <w:t>↓</w:t>
-      </w:r>
-      <w:r>
         <w:br/>
         <w:t>Run parallel workflow with 10 workers</w:t>
-      </w:r>
-      <w:r>
         <w:br/>
         <w:t>↓</w:t>
-      </w:r>
-      <w:r>
         <w:br/>
         <w:t>Record time</w:t>
-      </w:r>
-      <w:r>
         <w:br/>
         <w:t>↓</w:t>
-      </w:r>
-      <w:r>
         <w:br/>
         <w:t>Run parallel workflow with 20 workers</w:t>
-      </w:r>
-      <w:r>
         <w:br/>
         <w:t>↓</w:t>
-      </w:r>
-      <w:r>
         <w:br/>
         <w:t>Record time</w:t>
-      </w:r>
-      <w:r>
         <w:br/>
         <w:t>↓</w:t>
-      </w:r>
-      <w:r>
         <w:br/>
         <w:t>Create timing comparison table</w:t>
-      </w:r>
-      <w:r>
         <w:br/>
         <w:t>↓</w:t>
-      </w:r>
-      <w:r>
         <w:br/>
-        <w:t>Insert outputs into scientific paper</w:t>
-      </w:r>
-      <w:r>
+        <w:t>Insert outputs into the report</w:t>
         <w:br/>
         <w:t>↓</w:t>
-      </w:r>
-      <w:r>
         <w:br/>
         <w:t>End</w:t>
       </w:r>

</xml_diff>

<commit_message>
Fix References: list below References heading
Made-by: Omar
</commit_message>
<xml_diff>
--- a/5004CMD_Project_Report.docx
+++ b/5004CMD_Project_Report.docx
@@ -2400,51 +2400,51 @@
       </w:r>
     </w:p>
     <w:p>
-      <w:r>
-        <w:br w:type="page"/>
-      </w:r>
-    </w:p>
-    <w:p>
-      <w:r>
-        <w:t>Wickham, H., Grolemund, G. (2017). R for data science. O'Reilly Media.</w:t>
-      </w:r>
-    </w:p>
-    <w:p>
-      <w:r>
-        <w:t>Rocklin, M. (2015). Dask parallel computation with blocked algorithms and task scheduling. Proceedings of the 14th Python in Science Conference.</w:t>
-      </w:r>
-    </w:p>
-    <w:p>
-      <w:r>
-        <w:t>Pedregosa, F., Varoquaux, G., Gramfort, A., Michel, V., Thirion, B., Grisel, O., Blondel, M., Prettenhofer, P., Weiss, R., Dubourg, V., Vanderplas, J., Passos, A., Cournapeau, D., Brucher, M., Perrot, M., Duchesnay, E. (2011). Scikit learn machine learning in Python. Journal of Machine Learning Research, 12, 2825 to 2830.</w:t>
-      </w:r>
-    </w:p>
-    <w:p>
-      <w:r>
-        <w:t>McKinney, W. (2010). Data structures for statistical computing in Python. Proceedings of the 9th Python in Science Conference, 56 to 61.</w:t>
-      </w:r>
-    </w:p>
-    <w:p>
-      <w:r>
-        <w:t>James, G., Witten, D., Hastie, T., Tibshirani, R. (2021). An introduction to statistical learning with applications in Python. Springer.</w:t>
-      </w:r>
-    </w:p>
-    <w:p>
-      <w:r>
-        <w:t>Dask Development Team. (2024). Dask documentation. https://docs.dask.org</w:t>
-      </w:r>
-    </w:p>
-    <w:p>
-      <w:r>
-        <w:t>Bureau of Transportation Statistics. (2024). Trips by distance dataset. https://data.bts.gov</w:t>
-      </w:r>
-    </w:p>
-    <w:p>
       <w:pPr>
         <w:pStyle w:val="Heading1"/>
       </w:pPr>
       <w:r>
         <w:t>References</w:t>
+      </w:r>
+    </w:p>
+    <w:p>
+      <w:r>
+        <w:t>Bureau of Transportation Statistics. (2024). Trips by distance dataset. https://data.bts.gov</w:t>
+      </w:r>
+    </w:p>
+    <w:p>
+      <w:r>
+        <w:t>Dask Development Team. (2024). Dask documentation. https://docs.dask.org</w:t>
+      </w:r>
+    </w:p>
+    <w:p>
+      <w:r>
+        <w:t>James, G., Witten, D., Hastie, T., Tibshirani, R. (2021). An introduction to statistical learning with applications in Python. Springer.</w:t>
+      </w:r>
+    </w:p>
+    <w:p>
+      <w:r>
+        <w:t>McKinney, W. (2010). Data structures for statistical computing in Python. Proceedings of the 9th Python in Science Conference, 56 to 61.</w:t>
+      </w:r>
+    </w:p>
+    <w:p>
+      <w:r>
+        <w:t>Pedregosa, F., Varoquaux, G., Gramfort, A., Michel, V., Thirion, B., Grisel, O., Blondel, M., Prettenhofer, P., Weiss, R., Dubourg, V., Vanderplas, J., Passos, A., Cournapeau, D., Brucher, M., Perrot, M., Duchesnay, E. (2011). Scikit learn machine learning in Python. Journal of Machine Learning Research, 12, 2825 to 2830.</w:t>
+      </w:r>
+    </w:p>
+    <w:p>
+      <w:r>
+        <w:t>Rocklin, M. (2015). Dask parallel computation with blocked algorithms and task scheduling. Proceedings of the 14th Python in Science Conference.</w:t>
+      </w:r>
+    </w:p>
+    <w:p>
+      <w:r>
+        <w:t>Wickham, H., Grolemund, G. (2017). R for data science. O'Reilly Media.</w:t>
+      </w:r>
+    </w:p>
+    <w:p>
+      <w:r>
+        <w:br w:type="page"/>
       </w:r>
     </w:p>
     <w:p>

</xml_diff>

<commit_message>
Update report and exported PDF
Made-by: Omar
</commit_message>
<xml_diff>
--- a/5004CMD_Project_Report.docx
+++ b/5004CMD_Project_Report.docx
@@ -258,7 +258,7 @@
           </mc:Choice>
           <mc:Fallback>
             <w:pict>
-              <v:group w14:anchorId="2AFF658F" id="Group 157" o:spid="_x0000_s1026" style="position:absolute;margin-left:0;margin-top:0;width:611.25pt;height:95.7pt;z-index:251661312;mso-height-percent:121;mso-position-horizontal-relative:page;mso-position-vertical-relative:page;mso-height-percent:121" coordorigin="" coordsize="73152,12161" o:gfxdata="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">
+              <v:group w14:anchorId="712BDA3C" id="Group 157" o:spid="_x0000_s1026" style="position:absolute;margin-left:0;margin-top:0;width:611.25pt;height:95.7pt;z-index:251661312;mso-height-percent:121;mso-position-horizontal-relative:page;mso-position-vertical-relative:page;mso-height-percent:121" coordorigin="" coordsize="73152,12161" o:gfxdata="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">
                 <v:shape id="Rectangle 51" o:spid="_x0000_s1027" style="position:absolute;width:73152;height:11303;visibility:visible;mso-wrap-style:square;v-text-anchor:middle" coordsize="7312660,1129665" o:gfxdata="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" path="m,l7312660,r,1129665l3619500,733425,,1091565,,xe" fillcolor="#4f81bd [3204]" stroked="f" strokeweight="2pt">
                   <v:path arrowok="t" o:connecttype="custom" o:connectlocs="0,0;7315200,0;7315200,1130373;3620757,733885;0,1092249;0,0" o:connectangles="0,0,0,0,0,0"/>
                 </v:shape>
@@ -287,21 +287,41 @@
       </w:pPr>
       <w:r>
         <w:t>Module</w:t>
+      </w:r>
+      <w:r>
         <w:br/>
         <w:t>5004CMD Data Science</w:t>
+      </w:r>
+      <w:r>
         <w:br/>
+      </w:r>
+      <w:r>
         <w:br/>
         <w:t>Student ID</w:t>
+      </w:r>
+      <w:r>
         <w:br/>
         <w:t>14498572</w:t>
+      </w:r>
+      <w:r>
         <w:br/>
+      </w:r>
+      <w:r>
         <w:br/>
         <w:t>Submission date</w:t>
+      </w:r>
+      <w:r>
         <w:br/>
         <w:t>30 March 2026</w:t>
+      </w:r>
+      <w:r>
         <w:br/>
+      </w:r>
+      <w:r>
         <w:br/>
         <w:t>Word count</w:t>
+      </w:r>
+      <w:r>
         <w:br/>
         <w:t>2214</w:t>
       </w:r>
@@ -362,7 +382,12 @@
               <w:tab w:val="right" w:leader="dot" w:pos="8630"/>
             </w:tabs>
             <w:rPr>
+              <w:rFonts w:asciiTheme="minorHAnsi" w:hAnsiTheme="minorHAnsi"/>
               <w:noProof/>
+              <w:kern w:val="2"/>
+              <w:szCs w:val="24"/>
+              <w:lang w:val="en-GB" w:eastAsia="en-GB"/>
+              <w14:ligatures w14:val="standardContextual"/>
             </w:rPr>
           </w:pPr>
           <w:r>
@@ -374,7 +399,7 @@
           <w:r>
             <w:fldChar w:fldCharType="separate"/>
           </w:r>
-          <w:hyperlink w:anchor="_Toc225601591" w:history="1">
+          <w:hyperlink w:anchor="_Toc225765969" w:history="1">
             <w:r>
               <w:rPr>
                 <w:rStyle w:val="Hyperlink"/>
@@ -401,7 +426,153 @@
                 <w:noProof/>
                 <w:webHidden/>
               </w:rPr>
-              <w:instrText xml:space="preserve"> PAGEREF _Toc225601591 \h </w:instrText>
+              <w:instrText xml:space="preserve"> PAGEREF _Toc225765969 \h </w:instrText>
+            </w:r>
+            <w:r>
+              <w:rPr>
+                <w:noProof/>
+                <w:webHidden/>
+              </w:rPr>
+            </w:r>
+            <w:r>
+              <w:rPr>
+                <w:noProof/>
+                <w:webHidden/>
+              </w:rPr>
+              <w:fldChar w:fldCharType="separate"/>
+            </w:r>
+            <w:r>
+              <w:rPr>
+                <w:noProof/>
+                <w:webHidden/>
+              </w:rPr>
+              <w:t>2</w:t>
+            </w:r>
+            <w:r>
+              <w:rPr>
+                <w:noProof/>
+                <w:webHidden/>
+              </w:rPr>
+              <w:fldChar w:fldCharType="end"/>
+            </w:r>
+          </w:hyperlink>
+        </w:p>
+        <w:p>
+          <w:pPr>
+            <w:pStyle w:val="TOC1"/>
+            <w:tabs>
+              <w:tab w:val="right" w:leader="dot" w:pos="8630"/>
+            </w:tabs>
+            <w:rPr>
+              <w:rFonts w:asciiTheme="minorHAnsi" w:hAnsiTheme="minorHAnsi"/>
+              <w:noProof/>
+              <w:kern w:val="2"/>
+              <w:szCs w:val="24"/>
+              <w:lang w:val="en-GB" w:eastAsia="en-GB"/>
+              <w14:ligatures w14:val="standardContextual"/>
+            </w:rPr>
+          </w:pPr>
+          <w:hyperlink w:anchor="_Toc225765970" w:history="1">
+            <w:r>
+              <w:rPr>
+                <w:rStyle w:val="Hyperlink"/>
+                <w:noProof/>
+              </w:rPr>
+              <w:t>Datasets</w:t>
+            </w:r>
+            <w:r>
+              <w:rPr>
+                <w:noProof/>
+                <w:webHidden/>
+              </w:rPr>
+              <w:tab/>
+            </w:r>
+            <w:r>
+              <w:rPr>
+                <w:noProof/>
+                <w:webHidden/>
+              </w:rPr>
+              <w:fldChar w:fldCharType="begin"/>
+            </w:r>
+            <w:r>
+              <w:rPr>
+                <w:noProof/>
+                <w:webHidden/>
+              </w:rPr>
+              <w:instrText xml:space="preserve"> PAGEREF _Toc225765970 \h </w:instrText>
+            </w:r>
+            <w:r>
+              <w:rPr>
+                <w:noProof/>
+                <w:webHidden/>
+              </w:rPr>
+            </w:r>
+            <w:r>
+              <w:rPr>
+                <w:noProof/>
+                <w:webHidden/>
+              </w:rPr>
+              <w:fldChar w:fldCharType="separate"/>
+            </w:r>
+            <w:r>
+              <w:rPr>
+                <w:noProof/>
+                <w:webHidden/>
+              </w:rPr>
+              <w:t>2</w:t>
+            </w:r>
+            <w:r>
+              <w:rPr>
+                <w:noProof/>
+                <w:webHidden/>
+              </w:rPr>
+              <w:fldChar w:fldCharType="end"/>
+            </w:r>
+          </w:hyperlink>
+        </w:p>
+        <w:p>
+          <w:pPr>
+            <w:pStyle w:val="TOC1"/>
+            <w:tabs>
+              <w:tab w:val="right" w:leader="dot" w:pos="8630"/>
+            </w:tabs>
+            <w:rPr>
+              <w:rFonts w:asciiTheme="minorHAnsi" w:hAnsiTheme="minorHAnsi"/>
+              <w:noProof/>
+              <w:kern w:val="2"/>
+              <w:szCs w:val="24"/>
+              <w:lang w:val="en-GB" w:eastAsia="en-GB"/>
+              <w14:ligatures w14:val="standardContextual"/>
+            </w:rPr>
+          </w:pPr>
+          <w:hyperlink w:anchor="_Toc225765971" w:history="1">
+            <w:r>
+              <w:rPr>
+                <w:rStyle w:val="Hyperlink"/>
+                <w:noProof/>
+              </w:rPr>
+              <w:t>Methodology</w:t>
+            </w:r>
+            <w:r>
+              <w:rPr>
+                <w:noProof/>
+                <w:webHidden/>
+              </w:rPr>
+              <w:tab/>
+            </w:r>
+            <w:r>
+              <w:rPr>
+                <w:noProof/>
+                <w:webHidden/>
+              </w:rPr>
+              <w:fldChar w:fldCharType="begin"/>
+            </w:r>
+            <w:r>
+              <w:rPr>
+                <w:noProof/>
+                <w:webHidden/>
+              </w:rPr>
+              <w:instrText xml:space="preserve"> PAGEREF _Toc225765971 \h </w:instrText>
             </w:r>
             <w:r>
               <w:rPr>
@@ -439,214 +610,15 @@
               <w:tab w:val="right" w:leader="dot" w:pos="8630"/>
             </w:tabs>
             <w:rPr>
+              <w:rFonts w:asciiTheme="minorHAnsi" w:hAnsiTheme="minorHAnsi"/>
               <w:noProof/>
+              <w:kern w:val="2"/>
+              <w:szCs w:val="24"/>
+              <w:lang w:val="en-GB" w:eastAsia="en-GB"/>
+              <w14:ligatures w14:val="standardContextual"/>
             </w:rPr>
           </w:pPr>
-          <w:hyperlink w:anchor="_Toc225601592" w:history="1">
-            <w:r>
-              <w:rPr>
-                <w:rStyle w:val="Hyperlink"/>
-                <w:noProof/>
-              </w:rPr>
-              <w:t>Datasets</w:t>
-            </w:r>
-            <w:r>
-              <w:rPr>
-                <w:noProof/>
-                <w:webHidden/>
-              </w:rPr>
-              <w:tab/>
-            </w:r>
-            <w:r>
-              <w:rPr>
-                <w:noProof/>
-                <w:webHidden/>
-              </w:rPr>
-              <w:fldChar w:fldCharType="begin"/>
-            </w:r>
-            <w:r>
-              <w:rPr>
-                <w:noProof/>
-                <w:webHidden/>
-              </w:rPr>
-              <w:instrText xml:space="preserve"> PAGEREF _Toc225601592 \h </w:instrText>
-            </w:r>
-            <w:r>
-              <w:rPr>
-                <w:noProof/>
-                <w:webHidden/>
-              </w:rPr>
-            </w:r>
-            <w:r>
-              <w:rPr>
-                <w:noProof/>
-                <w:webHidden/>
-              </w:rPr>
-              <w:fldChar w:fldCharType="separate"/>
-            </w:r>
-            <w:r>
-              <w:rPr>
-                <w:noProof/>
-                <w:webHidden/>
-              </w:rPr>
-              <w:t>3</w:t>
-            </w:r>
-            <w:r>
-              <w:rPr>
-                <w:noProof/>
-                <w:webHidden/>
-              </w:rPr>
-              <w:fldChar w:fldCharType="end"/>
-            </w:r>
-          </w:hyperlink>
-        </w:p>
-        <w:p>
-          <w:pPr>
-            <w:pStyle w:val="TOC1"/>
-            <w:tabs>
-              <w:tab w:val="right" w:leader="dot" w:pos="8630"/>
-            </w:tabs>
-            <w:rPr>
-              <w:noProof/>
-            </w:rPr>
-          </w:pPr>
-          <w:hyperlink w:anchor="_Toc225601593" w:history="1">
-            <w:r>
-              <w:rPr>
-                <w:rStyle w:val="Hyperlink"/>
-                <w:noProof/>
-              </w:rPr>
-              <w:t>Methodology</w:t>
-            </w:r>
-            <w:r>
-              <w:rPr>
-                <w:noProof/>
-                <w:webHidden/>
-              </w:rPr>
-              <w:tab/>
-            </w:r>
-            <w:r>
-              <w:rPr>
-                <w:noProof/>
-                <w:webHidden/>
-              </w:rPr>
-              <w:fldChar w:fldCharType="begin"/>
-            </w:r>
-            <w:r>
-              <w:rPr>
-                <w:noProof/>
-                <w:webHidden/>
-              </w:rPr>
-              <w:instrText xml:space="preserve"> PAGEREF _Toc225601593 \h </w:instrText>
-            </w:r>
-            <w:r>
-              <w:rPr>
-                <w:noProof/>
-                <w:webHidden/>
-              </w:rPr>
-            </w:r>
-            <w:r>
-              <w:rPr>
-                <w:noProof/>
-                <w:webHidden/>
-              </w:rPr>
-              <w:fldChar w:fldCharType="separate"/>
-            </w:r>
-            <w:r>
-              <w:rPr>
-                <w:noProof/>
-                <w:webHidden/>
-              </w:rPr>
-              <w:t>4</w:t>
-            </w:r>
-            <w:r>
-              <w:rPr>
-                <w:noProof/>
-                <w:webHidden/>
-              </w:rPr>
-              <w:fldChar w:fldCharType="end"/>
-            </w:r>
-          </w:hyperlink>
-        </w:p>
-        <w:p>
-          <w:pPr>
-            <w:pStyle w:val="TOC1"/>
-            <w:tabs>
-              <w:tab w:val="right" w:leader="dot" w:pos="8630"/>
-            </w:tabs>
-            <w:rPr>
-              <w:noProof/>
-            </w:rPr>
-          </w:pPr>
-          <w:hyperlink w:anchor="_Toc225601594" w:history="1">
-            <w:r>
-              <w:rPr>
-                <w:rStyle w:val="Hyperlink"/>
-                <w:noProof/>
-              </w:rPr>
-              <w:t>Exploratory Data Analysis</w:t>
-            </w:r>
-            <w:r>
-              <w:rPr>
-                <w:noProof/>
-                <w:webHidden/>
-              </w:rPr>
-              <w:tab/>
-            </w:r>
-            <w:r>
-              <w:rPr>
-                <w:noProof/>
-                <w:webHidden/>
-              </w:rPr>
-              <w:fldChar w:fldCharType="begin"/>
-            </w:r>
-            <w:r>
-              <w:rPr>
-                <w:noProof/>
-                <w:webHidden/>
-              </w:rPr>
-              <w:instrText xml:space="preserve"> PAGEREF _Toc225601594 \h </w:instrText>
-            </w:r>
-            <w:r>
-              <w:rPr>
-                <w:noProof/>
-                <w:webHidden/>
-              </w:rPr>
-            </w:r>
-            <w:r>
-              <w:rPr>
-                <w:noProof/>
-                <w:webHidden/>
-              </w:rPr>
-              <w:fldChar w:fldCharType="separate"/>
-            </w:r>
-            <w:r>
-              <w:rPr>
-                <w:noProof/>
-                <w:webHidden/>
-              </w:rPr>
-              <w:t>4</w:t>
-            </w:r>
-            <w:r>
-              <w:rPr>
-                <w:noProof/>
-                <w:webHidden/>
-              </w:rPr>
-              <w:fldChar w:fldCharType="end"/>
-            </w:r>
-          </w:hyperlink>
-        </w:p>
-        <w:p>
-          <w:pPr>
-            <w:pStyle w:val="TOC1"/>
-            <w:tabs>
-              <w:tab w:val="right" w:leader="dot" w:pos="8630"/>
-            </w:tabs>
-            <w:rPr>
-              <w:noProof/>
-            </w:rPr>
-          </w:pPr>
-          <w:hyperlink w:anchor="_Toc225601595" w:history="1">
+          <w:hyperlink w:anchor="_Toc225765972" w:history="1">
             <w:r>
               <w:rPr>
                 <w:rStyle w:val="Hyperlink"/>
@@ -673,7 +645,7 @@
                 <w:noProof/>
                 <w:webHidden/>
               </w:rPr>
-              <w:instrText xml:space="preserve"> PAGEREF _Toc225601595 \h </w:instrText>
+              <w:instrText xml:space="preserve"> PAGEREF _Toc225765972 \h </w:instrText>
             </w:r>
             <w:r>
               <w:rPr>
@@ -711,10 +683,15 @@
               <w:tab w:val="right" w:leader="dot" w:pos="8630"/>
             </w:tabs>
             <w:rPr>
+              <w:rFonts w:asciiTheme="minorHAnsi" w:hAnsiTheme="minorHAnsi"/>
               <w:noProof/>
+              <w:kern w:val="2"/>
+              <w:szCs w:val="24"/>
+              <w:lang w:val="en-GB" w:eastAsia="en-GB"/>
+              <w14:ligatures w14:val="standardContextual"/>
             </w:rPr>
           </w:pPr>
-          <w:hyperlink w:anchor="_Toc225601596" w:history="1">
+          <w:hyperlink w:anchor="_Toc225765973" w:history="1">
             <w:r>
               <w:rPr>
                 <w:rStyle w:val="Hyperlink"/>
@@ -741,7 +718,80 @@
                 <w:noProof/>
                 <w:webHidden/>
               </w:rPr>
-              <w:instrText xml:space="preserve"> PAGEREF _Toc225601596 \h </w:instrText>
+              <w:instrText xml:space="preserve"> PAGEREF _Toc225765973 \h </w:instrText>
+            </w:r>
+            <w:r>
+              <w:rPr>
+                <w:noProof/>
+                <w:webHidden/>
+              </w:rPr>
+            </w:r>
+            <w:r>
+              <w:rPr>
+                <w:noProof/>
+                <w:webHidden/>
+              </w:rPr>
+              <w:fldChar w:fldCharType="separate"/>
+            </w:r>
+            <w:r>
+              <w:rPr>
+                <w:noProof/>
+                <w:webHidden/>
+              </w:rPr>
+              <w:t>6</w:t>
+            </w:r>
+            <w:r>
+              <w:rPr>
+                <w:noProof/>
+                <w:webHidden/>
+              </w:rPr>
+              <w:fldChar w:fldCharType="end"/>
+            </w:r>
+          </w:hyperlink>
+        </w:p>
+        <w:p>
+          <w:pPr>
+            <w:pStyle w:val="TOC1"/>
+            <w:tabs>
+              <w:tab w:val="right" w:leader="dot" w:pos="8630"/>
+            </w:tabs>
+            <w:rPr>
+              <w:rFonts w:asciiTheme="minorHAnsi" w:hAnsiTheme="minorHAnsi"/>
+              <w:noProof/>
+              <w:kern w:val="2"/>
+              <w:szCs w:val="24"/>
+              <w:lang w:val="en-GB" w:eastAsia="en-GB"/>
+              <w14:ligatures w14:val="standardContextual"/>
+            </w:rPr>
+          </w:pPr>
+          <w:hyperlink w:anchor="_Toc225765974" w:history="1">
+            <w:r>
+              <w:rPr>
+                <w:rStyle w:val="Hyperlink"/>
+                <w:noProof/>
+              </w:rPr>
+              <w:t>Model Evaluation</w:t>
+            </w:r>
+            <w:r>
+              <w:rPr>
+                <w:noProof/>
+                <w:webHidden/>
+              </w:rPr>
+              <w:tab/>
+            </w:r>
+            <w:r>
+              <w:rPr>
+                <w:noProof/>
+                <w:webHidden/>
+              </w:rPr>
+              <w:fldChar w:fldCharType="begin"/>
+            </w:r>
+            <w:r>
+              <w:rPr>
+                <w:noProof/>
+                <w:webHidden/>
+              </w:rPr>
+              <w:instrText xml:space="preserve"> PAGEREF _Toc225765974 \h </w:instrText>
             </w:r>
             <w:r>
               <w:rPr>
@@ -779,16 +829,21 @@
               <w:tab w:val="right" w:leader="dot" w:pos="8630"/>
             </w:tabs>
             <w:rPr>
+              <w:rFonts w:asciiTheme="minorHAnsi" w:hAnsiTheme="minorHAnsi"/>
               <w:noProof/>
+              <w:kern w:val="2"/>
+              <w:szCs w:val="24"/>
+              <w:lang w:val="en-GB" w:eastAsia="en-GB"/>
+              <w14:ligatures w14:val="standardContextual"/>
             </w:rPr>
           </w:pPr>
-          <w:hyperlink w:anchor="_Toc225601597" w:history="1">
+          <w:hyperlink w:anchor="_Toc225765975" w:history="1">
             <w:r>
               <w:rPr>
                 <w:rStyle w:val="Hyperlink"/>
                 <w:noProof/>
               </w:rPr>
-              <w:t>Model Evaluation</w:t>
+              <w:t>Travellers by Distance Band</w:t>
             </w:r>
             <w:r>
               <w:rPr>
@@ -809,7 +864,7 @@
                 <w:noProof/>
                 <w:webHidden/>
               </w:rPr>
-              <w:instrText xml:space="preserve"> PAGEREF _Toc225601597 \h </w:instrText>
+              <w:instrText xml:space="preserve"> PAGEREF _Toc225765975 \h </w:instrText>
             </w:r>
             <w:r>
               <w:rPr>
@@ -847,16 +902,21 @@
               <w:tab w:val="right" w:leader="dot" w:pos="8630"/>
             </w:tabs>
             <w:rPr>
+              <w:rFonts w:asciiTheme="minorHAnsi" w:hAnsiTheme="minorHAnsi"/>
               <w:noProof/>
+              <w:kern w:val="2"/>
+              <w:szCs w:val="24"/>
+              <w:lang w:val="en-GB" w:eastAsia="en-GB"/>
+              <w14:ligatures w14:val="standardContextual"/>
             </w:rPr>
           </w:pPr>
-          <w:hyperlink w:anchor="_Toc225601598" w:history="1">
+          <w:hyperlink w:anchor="_Toc225765976" w:history="1">
             <w:r>
               <w:rPr>
                 <w:rStyle w:val="Hyperlink"/>
                 <w:noProof/>
               </w:rPr>
-              <w:t>Travellers by Distance Band</w:t>
+              <w:t>Parallel Processing Comparison</w:t>
             </w:r>
             <w:r>
               <w:rPr>
@@ -877,7 +937,80 @@
                 <w:noProof/>
                 <w:webHidden/>
               </w:rPr>
-              <w:instrText xml:space="preserve"> PAGEREF _Toc225601598 \h </w:instrText>
+              <w:instrText xml:space="preserve"> PAGEREF _Toc225765976 \h </w:instrText>
+            </w:r>
+            <w:r>
+              <w:rPr>
+                <w:noProof/>
+                <w:webHidden/>
+              </w:rPr>
+            </w:r>
+            <w:r>
+              <w:rPr>
+                <w:noProof/>
+                <w:webHidden/>
+              </w:rPr>
+              <w:fldChar w:fldCharType="separate"/>
+            </w:r>
+            <w:r>
+              <w:rPr>
+                <w:noProof/>
+                <w:webHidden/>
+              </w:rPr>
+              <w:t>8</w:t>
+            </w:r>
+            <w:r>
+              <w:rPr>
+                <w:noProof/>
+                <w:webHidden/>
+              </w:rPr>
+              <w:fldChar w:fldCharType="end"/>
+            </w:r>
+          </w:hyperlink>
+        </w:p>
+        <w:p>
+          <w:pPr>
+            <w:pStyle w:val="TOC1"/>
+            <w:tabs>
+              <w:tab w:val="right" w:leader="dot" w:pos="8630"/>
+            </w:tabs>
+            <w:rPr>
+              <w:rFonts w:asciiTheme="minorHAnsi" w:hAnsiTheme="minorHAnsi"/>
+              <w:noProof/>
+              <w:kern w:val="2"/>
+              <w:szCs w:val="24"/>
+              <w:lang w:val="en-GB" w:eastAsia="en-GB"/>
+              <w14:ligatures w14:val="standardContextual"/>
+            </w:rPr>
+          </w:pPr>
+          <w:hyperlink w:anchor="_Toc225765977" w:history="1">
+            <w:r>
+              <w:rPr>
+                <w:rStyle w:val="Hyperlink"/>
+                <w:noProof/>
+              </w:rPr>
+              <w:t>Discussion</w:t>
+            </w:r>
+            <w:r>
+              <w:rPr>
+                <w:noProof/>
+                <w:webHidden/>
+              </w:rPr>
+              <w:tab/>
+            </w:r>
+            <w:r>
+              <w:rPr>
+                <w:noProof/>
+                <w:webHidden/>
+              </w:rPr>
+              <w:fldChar w:fldCharType="begin"/>
+            </w:r>
+            <w:r>
+              <w:rPr>
+                <w:noProof/>
+                <w:webHidden/>
+              </w:rPr>
+              <w:instrText xml:space="preserve"> PAGEREF _Toc225765977 \h </w:instrText>
             </w:r>
             <w:r>
               <w:rPr>
@@ -915,16 +1048,21 @@
               <w:tab w:val="right" w:leader="dot" w:pos="8630"/>
             </w:tabs>
             <w:rPr>
+              <w:rFonts w:asciiTheme="minorHAnsi" w:hAnsiTheme="minorHAnsi"/>
               <w:noProof/>
+              <w:kern w:val="2"/>
+              <w:szCs w:val="24"/>
+              <w:lang w:val="en-GB" w:eastAsia="en-GB"/>
+              <w14:ligatures w14:val="standardContextual"/>
             </w:rPr>
           </w:pPr>
-          <w:hyperlink w:anchor="_Toc225601599" w:history="1">
+          <w:hyperlink w:anchor="_Toc225765978" w:history="1">
             <w:r>
               <w:rPr>
                 <w:rStyle w:val="Hyperlink"/>
                 <w:noProof/>
               </w:rPr>
-              <w:t>Parallel Processing Comparison</w:t>
+              <w:t>Limitations</w:t>
             </w:r>
             <w:r>
               <w:rPr>
@@ -945,7 +1083,7 @@
                 <w:noProof/>
                 <w:webHidden/>
               </w:rPr>
-              <w:instrText xml:space="preserve"> PAGEREF _Toc225601599 \h </w:instrText>
+              <w:instrText xml:space="preserve"> PAGEREF _Toc225765978 \h </w:instrText>
             </w:r>
             <w:r>
               <w:rPr>
@@ -983,16 +1121,21 @@
               <w:tab w:val="right" w:leader="dot" w:pos="8630"/>
             </w:tabs>
             <w:rPr>
+              <w:rFonts w:asciiTheme="minorHAnsi" w:hAnsiTheme="minorHAnsi"/>
               <w:noProof/>
+              <w:kern w:val="2"/>
+              <w:szCs w:val="24"/>
+              <w:lang w:val="en-GB" w:eastAsia="en-GB"/>
+              <w14:ligatures w14:val="standardContextual"/>
             </w:rPr>
           </w:pPr>
-          <w:hyperlink w:anchor="_Toc225601600" w:history="1">
+          <w:hyperlink w:anchor="_Toc225765979" w:history="1">
             <w:r>
               <w:rPr>
                 <w:rStyle w:val="Hyperlink"/>
                 <w:noProof/>
               </w:rPr>
-              <w:t>Discussion</w:t>
+              <w:t>Conclusion</w:t>
             </w:r>
             <w:r>
               <w:rPr>
@@ -1013,7 +1156,80 @@
                 <w:noProof/>
                 <w:webHidden/>
               </w:rPr>
-              <w:instrText xml:space="preserve"> PAGEREF _Toc225601600 \h </w:instrText>
+              <w:instrText xml:space="preserve"> PAGEREF _Toc225765979 \h </w:instrText>
+            </w:r>
+            <w:r>
+              <w:rPr>
+                <w:noProof/>
+                <w:webHidden/>
+              </w:rPr>
+            </w:r>
+            <w:r>
+              <w:rPr>
+                <w:noProof/>
+                <w:webHidden/>
+              </w:rPr>
+              <w:fldChar w:fldCharType="separate"/>
+            </w:r>
+            <w:r>
+              <w:rPr>
+                <w:noProof/>
+                <w:webHidden/>
+              </w:rPr>
+              <w:t>9</w:t>
+            </w:r>
+            <w:r>
+              <w:rPr>
+                <w:noProof/>
+                <w:webHidden/>
+              </w:rPr>
+              <w:fldChar w:fldCharType="end"/>
+            </w:r>
+          </w:hyperlink>
+        </w:p>
+        <w:p>
+          <w:pPr>
+            <w:pStyle w:val="TOC1"/>
+            <w:tabs>
+              <w:tab w:val="right" w:leader="dot" w:pos="8630"/>
+            </w:tabs>
+            <w:rPr>
+              <w:rFonts w:asciiTheme="minorHAnsi" w:hAnsiTheme="minorHAnsi"/>
+              <w:noProof/>
+              <w:kern w:val="2"/>
+              <w:szCs w:val="24"/>
+              <w:lang w:val="en-GB" w:eastAsia="en-GB"/>
+              <w14:ligatures w14:val="standardContextual"/>
+            </w:rPr>
+          </w:pPr>
+          <w:hyperlink w:anchor="_Toc225765980" w:history="1">
+            <w:r>
+              <w:rPr>
+                <w:rStyle w:val="Hyperlink"/>
+                <w:noProof/>
+              </w:rPr>
+              <w:t>References</w:t>
+            </w:r>
+            <w:r>
+              <w:rPr>
+                <w:noProof/>
+                <w:webHidden/>
+              </w:rPr>
+              <w:tab/>
+            </w:r>
+            <w:r>
+              <w:rPr>
+                <w:noProof/>
+                <w:webHidden/>
+              </w:rPr>
+              <w:fldChar w:fldCharType="begin"/>
+            </w:r>
+            <w:r>
+              <w:rPr>
+                <w:noProof/>
+                <w:webHidden/>
+              </w:rPr>
+              <w:instrText xml:space="preserve"> PAGEREF _Toc225765980 \h </w:instrText>
             </w:r>
             <w:r>
               <w:rPr>
@@ -1046,21 +1262,26 @@
         </w:p>
         <w:p>
           <w:pPr>
-            <w:pStyle w:val="TOC1"/>
+            <w:pStyle w:val="TOC2"/>
             <w:tabs>
               <w:tab w:val="right" w:leader="dot" w:pos="8630"/>
             </w:tabs>
             <w:rPr>
+              <w:rFonts w:asciiTheme="minorHAnsi" w:hAnsiTheme="minorHAnsi"/>
               <w:noProof/>
+              <w:kern w:val="2"/>
+              <w:szCs w:val="24"/>
+              <w:lang w:val="en-GB" w:eastAsia="en-GB"/>
+              <w14:ligatures w14:val="standardContextual"/>
             </w:rPr>
           </w:pPr>
-          <w:hyperlink w:anchor="_Toc225601601" w:history="1">
+          <w:hyperlink w:anchor="_Toc225765981" w:history="1">
             <w:r>
               <w:rPr>
                 <w:rStyle w:val="Hyperlink"/>
                 <w:noProof/>
               </w:rPr>
-              <w:t>Limitations</w:t>
+              <w:t>Pseudocode</w:t>
             </w:r>
             <w:r>
               <w:rPr>
@@ -1081,143 +1302,7 @@
                 <w:noProof/>
                 <w:webHidden/>
               </w:rPr>
-              <w:instrText xml:space="preserve"> PAGEREF _Toc225601601 \h </w:instrText>
-            </w:r>
-            <w:r>
-              <w:rPr>
-                <w:noProof/>
-                <w:webHidden/>
-              </w:rPr>
-            </w:r>
-            <w:r>
-              <w:rPr>
-                <w:noProof/>
-                <w:webHidden/>
-              </w:rPr>
-              <w:fldChar w:fldCharType="separate"/>
-            </w:r>
-            <w:r>
-              <w:rPr>
-                <w:noProof/>
-                <w:webHidden/>
-              </w:rPr>
-              <w:t>10</w:t>
-            </w:r>
-            <w:r>
-              <w:rPr>
-                <w:noProof/>
-                <w:webHidden/>
-              </w:rPr>
-              <w:fldChar w:fldCharType="end"/>
-            </w:r>
-          </w:hyperlink>
-        </w:p>
-        <w:p>
-          <w:pPr>
-            <w:pStyle w:val="TOC1"/>
-            <w:tabs>
-              <w:tab w:val="right" w:leader="dot" w:pos="8630"/>
-            </w:tabs>
-            <w:rPr>
-              <w:noProof/>
-            </w:rPr>
-          </w:pPr>
-          <w:hyperlink w:anchor="_Toc225601602" w:history="1">
-            <w:r>
-              <w:rPr>
-                <w:rStyle w:val="Hyperlink"/>
-                <w:noProof/>
-              </w:rPr>
-              <w:t>Conclusion</w:t>
-            </w:r>
-            <w:r>
-              <w:rPr>
-                <w:noProof/>
-                <w:webHidden/>
-              </w:rPr>
-              <w:tab/>
-            </w:r>
-            <w:r>
-              <w:rPr>
-                <w:noProof/>
-                <w:webHidden/>
-              </w:rPr>
-              <w:fldChar w:fldCharType="begin"/>
-            </w:r>
-            <w:r>
-              <w:rPr>
-                <w:noProof/>
-                <w:webHidden/>
-              </w:rPr>
-              <w:instrText xml:space="preserve"> PAGEREF _Toc225601602 \h </w:instrText>
-            </w:r>
-            <w:r>
-              <w:rPr>
-                <w:noProof/>
-                <w:webHidden/>
-              </w:rPr>
-            </w:r>
-            <w:r>
-              <w:rPr>
-                <w:noProof/>
-                <w:webHidden/>
-              </w:rPr>
-              <w:fldChar w:fldCharType="separate"/>
-            </w:r>
-            <w:r>
-              <w:rPr>
-                <w:noProof/>
-                <w:webHidden/>
-              </w:rPr>
-              <w:t>10</w:t>
-            </w:r>
-            <w:r>
-              <w:rPr>
-                <w:noProof/>
-                <w:webHidden/>
-              </w:rPr>
-              <w:fldChar w:fldCharType="end"/>
-            </w:r>
-          </w:hyperlink>
-        </w:p>
-        <w:p>
-          <w:pPr>
-            <w:pStyle w:val="TOC1"/>
-            <w:tabs>
-              <w:tab w:val="right" w:leader="dot" w:pos="8630"/>
-            </w:tabs>
-            <w:rPr>
-              <w:noProof/>
-            </w:rPr>
-          </w:pPr>
-          <w:hyperlink w:anchor="_Toc225601603" w:history="1">
-            <w:r>
-              <w:rPr>
-                <w:rStyle w:val="Hyperlink"/>
-                <w:noProof/>
-              </w:rPr>
-              <w:t>Appendix</w:t>
-            </w:r>
-            <w:r>
-              <w:rPr>
-                <w:noProof/>
-                <w:webHidden/>
-              </w:rPr>
-              <w:tab/>
-            </w:r>
-            <w:r>
-              <w:rPr>
-                <w:noProof/>
-                <w:webHidden/>
-              </w:rPr>
-              <w:fldChar w:fldCharType="begin"/>
-            </w:r>
-            <w:r>
-              <w:rPr>
-                <w:noProof/>
-                <w:webHidden/>
-              </w:rPr>
-              <w:instrText xml:space="preserve"> PAGEREF _Toc225601603 \h </w:instrText>
+              <w:instrText xml:space="preserve"> PAGEREF _Toc225765981 \h </w:instrText>
             </w:r>
             <w:r>
               <w:rPr>
@@ -1255,146 +1340,15 @@
               <w:tab w:val="right" w:leader="dot" w:pos="8630"/>
             </w:tabs>
             <w:rPr>
+              <w:rFonts w:asciiTheme="minorHAnsi" w:hAnsiTheme="minorHAnsi"/>
               <w:noProof/>
+              <w:kern w:val="2"/>
+              <w:szCs w:val="24"/>
+              <w:lang w:val="en-GB" w:eastAsia="en-GB"/>
+              <w14:ligatures w14:val="standardContextual"/>
             </w:rPr>
           </w:pPr>
-          <w:hyperlink w:anchor="_Toc225601604" w:history="1">
-            <w:r>
-              <w:rPr>
-                <w:rStyle w:val="Hyperlink"/>
-                <w:noProof/>
-              </w:rPr>
-              <w:t>AI declaration</w:t>
-            </w:r>
-            <w:r>
-              <w:rPr>
-                <w:noProof/>
-                <w:webHidden/>
-              </w:rPr>
-              <w:tab/>
-            </w:r>
-            <w:r>
-              <w:rPr>
-                <w:noProof/>
-                <w:webHidden/>
-              </w:rPr>
-              <w:fldChar w:fldCharType="begin"/>
-            </w:r>
-            <w:r>
-              <w:rPr>
-                <w:noProof/>
-                <w:webHidden/>
-              </w:rPr>
-              <w:instrText xml:space="preserve"> PAGEREF _Toc225601604 \h </w:instrText>
-            </w:r>
-            <w:r>
-              <w:rPr>
-                <w:noProof/>
-                <w:webHidden/>
-              </w:rPr>
-            </w:r>
-            <w:r>
-              <w:rPr>
-                <w:noProof/>
-                <w:webHidden/>
-              </w:rPr>
-              <w:fldChar w:fldCharType="separate"/>
-            </w:r>
-            <w:r>
-              <w:rPr>
-                <w:noProof/>
-                <w:webHidden/>
-              </w:rPr>
-              <w:t>11</w:t>
-            </w:r>
-            <w:r>
-              <w:rPr>
-                <w:noProof/>
-                <w:webHidden/>
-              </w:rPr>
-              <w:fldChar w:fldCharType="end"/>
-            </w:r>
-          </w:hyperlink>
-        </w:p>
-        <w:p>
-          <w:pPr>
-            <w:pStyle w:val="TOC2"/>
-            <w:tabs>
-              <w:tab w:val="right" w:leader="dot" w:pos="8630"/>
-            </w:tabs>
-            <w:rPr>
-              <w:noProof/>
-            </w:rPr>
-          </w:pPr>
-          <w:hyperlink w:anchor="_Toc225601605" w:history="1">
-            <w:r>
-              <w:rPr>
-                <w:rStyle w:val="Hyperlink"/>
-                <w:noProof/>
-              </w:rPr>
-              <w:t>Pseudocode</w:t>
-            </w:r>
-            <w:r>
-              <w:rPr>
-                <w:noProof/>
-                <w:webHidden/>
-              </w:rPr>
-              <w:tab/>
-            </w:r>
-            <w:r>
-              <w:rPr>
-                <w:noProof/>
-                <w:webHidden/>
-              </w:rPr>
-              <w:fldChar w:fldCharType="begin"/>
-            </w:r>
-            <w:r>
-              <w:rPr>
-                <w:noProof/>
-                <w:webHidden/>
-              </w:rPr>
-              <w:instrText xml:space="preserve"> PAGEREF _Toc225601605 \h </w:instrText>
-            </w:r>
-            <w:r>
-              <w:rPr>
-                <w:noProof/>
-                <w:webHidden/>
-              </w:rPr>
-            </w:r>
-            <w:r>
-              <w:rPr>
-                <w:noProof/>
-                <w:webHidden/>
-              </w:rPr>
-              <w:fldChar w:fldCharType="separate"/>
-            </w:r>
-            <w:r>
-              <w:rPr>
-                <w:noProof/>
-                <w:webHidden/>
-              </w:rPr>
-              <w:t>11</w:t>
-            </w:r>
-            <w:r>
-              <w:rPr>
-                <w:noProof/>
-                <w:webHidden/>
-              </w:rPr>
-              <w:fldChar w:fldCharType="end"/>
-            </w:r>
-          </w:hyperlink>
-        </w:p>
-        <w:p>
-          <w:pPr>
-            <w:pStyle w:val="TOC2"/>
-            <w:tabs>
-              <w:tab w:val="right" w:leader="dot" w:pos="8630"/>
-            </w:tabs>
-            <w:rPr>
-              <w:noProof/>
-            </w:rPr>
-          </w:pPr>
-          <w:hyperlink w:anchor="_Toc225601606" w:history="1">
+          <w:hyperlink w:anchor="_Toc225765982" w:history="1">
             <w:r>
               <w:rPr>
                 <w:rStyle w:val="Hyperlink"/>
@@ -1421,7 +1375,7 @@
                 <w:noProof/>
                 <w:webHidden/>
               </w:rPr>
-              <w:instrText xml:space="preserve"> PAGEREF _Toc225601606 \h </w:instrText>
+              <w:instrText xml:space="preserve"> PAGEREF _Toc225765982 \h </w:instrText>
             </w:r>
             <w:r>
               <w:rPr>
@@ -1453,6 +1407,79 @@
           </w:hyperlink>
         </w:p>
         <w:p>
+          <w:pPr>
+            <w:pStyle w:val="TOC1"/>
+            <w:tabs>
+              <w:tab w:val="right" w:leader="dot" w:pos="8630"/>
+            </w:tabs>
+            <w:rPr>
+              <w:rFonts w:asciiTheme="minorHAnsi" w:hAnsiTheme="minorHAnsi"/>
+              <w:noProof/>
+              <w:kern w:val="2"/>
+              <w:szCs w:val="24"/>
+              <w:lang w:val="en-GB" w:eastAsia="en-GB"/>
+              <w14:ligatures w14:val="standardContextual"/>
+            </w:rPr>
+          </w:pPr>
+          <w:hyperlink w:anchor="_Toc225765983" w:history="1">
+            <w:r>
+              <w:rPr>
+                <w:rStyle w:val="Hyperlink"/>
+                <w:noProof/>
+              </w:rPr>
+              <w:t>GitHub Link</w:t>
+            </w:r>
+            <w:r>
+              <w:rPr>
+                <w:noProof/>
+                <w:webHidden/>
+              </w:rPr>
+              <w:tab/>
+            </w:r>
+            <w:r>
+              <w:rPr>
+                <w:noProof/>
+                <w:webHidden/>
+              </w:rPr>
+              <w:fldChar w:fldCharType="begin"/>
+            </w:r>
+            <w:r>
+              <w:rPr>
+                <w:noProof/>
+                <w:webHidden/>
+              </w:rPr>
+              <w:instrText xml:space="preserve"> PAGEREF _Toc225765983 \h </w:instrText>
+            </w:r>
+            <w:r>
+              <w:rPr>
+                <w:noProof/>
+                <w:webHidden/>
+              </w:rPr>
+            </w:r>
+            <w:r>
+              <w:rPr>
+                <w:noProof/>
+                <w:webHidden/>
+              </w:rPr>
+              <w:fldChar w:fldCharType="separate"/>
+            </w:r>
+            <w:r>
+              <w:rPr>
+                <w:noProof/>
+                <w:webHidden/>
+              </w:rPr>
+              <w:t>13</w:t>
+            </w:r>
+            <w:r>
+              <w:rPr>
+                <w:noProof/>
+                <w:webHidden/>
+              </w:rPr>
+              <w:fldChar w:fldCharType="end"/>
+            </w:r>
+          </w:hyperlink>
+        </w:p>
+        <w:p>
           <w:r>
             <w:rPr>
               <w:b/>
@@ -1473,7 +1500,7 @@
       <w:pPr>
         <w:pStyle w:val="Heading1"/>
       </w:pPr>
-      <w:bookmarkStart w:id="0" w:name="_Toc225601591"/>
+      <w:bookmarkStart w:id="0" w:name="_Toc225765969"/>
       <w:r>
         <w:lastRenderedPageBreak/>
         <w:t>Introduction</w:t>
@@ -1481,7 +1508,6 @@
       <w:bookmarkEnd w:id="0"/>
     </w:p>
     <w:p>
-      <w:bookmarkStart w:id="1" w:name="_Toc225601592"/>
       <w:r>
         <w:t>Though often unseen, mobility datasets capture how large groups move across distances and moments. These records help decode actual travel needs instead of assumed patterns. Where roads strain or emissions rise, such data reveal pressure points clearly. Real-world movement becomes a reference when cities rezone, tolls shift, or access reshapes behavior. Rather than predicting, they show what already happens - trip after trip.</w:t>
       </w:r>
@@ -1554,13 +1580,13 @@
       <w:pPr>
         <w:pStyle w:val="Heading1"/>
       </w:pPr>
+      <w:bookmarkStart w:id="1" w:name="_Toc225765970"/>
       <w:r>
         <w:t>Datasets</w:t>
       </w:r>
       <w:bookmarkEnd w:id="1"/>
     </w:p>
     <w:p>
-      <w:bookmarkStart w:id="2" w:name="_Toc225601593"/>
       <w:r>
         <w:t xml:space="preserve">Inside Trips_by_Distance.csv are entries marked by Level, Date, and Week, followed by figures showing how many people stayed home versus those who did not. This file also tracks overall travel numbers alongside grouped ranges like trips between five and ten or ten to twenty-five. Meanwhile, </w:t>
       </w:r>
@@ -1570,7 +1596,11 @@
       </w:r>
       <w:proofErr w:type="spellEnd"/>
       <w:r>
-        <w:t xml:space="preserve"> Data.csv logs nationwide daily movement across categories ranging from under one mile up to more than five hundred miles. It includes matching totals for both residents and total journeys, supporting broader analysis when combined with the other dataset. Though separate, each contributes distinct pieces needed to understand mobility patterns over time.</w:t>
+        <w:t xml:space="preserve"> Data.csv logs nationwide daily movement across categories ranging from under one mile up to more than five hundred miles. It includes matching totals for both residents and total journeys, supporting broader analysis </w:t>
+      </w:r>
+      <w:r>
+        <w:lastRenderedPageBreak/>
+        <w:t>when combined with the other dataset. Though separate, each contributes distinct pieces needed to understand mobility patterns over time.</w:t>
       </w:r>
     </w:p>
     <w:p>
@@ -1581,7 +1611,6 @@
         </w:rPr>
       </w:pPr>
       <w:r>
-        <w:lastRenderedPageBreak/>
         <w:t>Beginning with national filtering ensures consistency within one region over time. When datetime values convert properly, sorting happens correctly - also allowing precise joins using date fields. Instead of letting duplicates skew results, removing them prevents exaggerated averages and faulty frequency counts. After keeping only National entries, extra location-based columns get discarded; this streamlines structure while minimizing type detection errors during parallel CSV processing.</w:t>
       </w:r>
     </w:p>
@@ -1589,13 +1618,13 @@
       <w:pPr>
         <w:pStyle w:val="Heading1"/>
       </w:pPr>
+      <w:bookmarkStart w:id="2" w:name="_Toc225765971"/>
       <w:r>
         <w:t>Methodology</w:t>
       </w:r>
       <w:bookmarkEnd w:id="2"/>
     </w:p>
     <w:p>
-      <w:bookmarkStart w:id="3" w:name="_Toc225601594"/>
       <w:r>
         <w:t xml:space="preserve">Pandas </w:t>
       </w:r>
@@ -1642,7 +1671,11 @@
     </w:p>
     <w:p>
       <w:r>
-        <w:t xml:space="preserve">Even when trip counts range from ten to twenty-five, thresholds single out days where activity passes ten million trips - either in that band or fifty to one hundred - to mark intense travel periods for clearer visual contrast. On matching dates within shared national coverage, regression links shorter journeys (1–25 miles) pulled from </w:t>
+        <w:t xml:space="preserve">Even when trip counts range from ten to twenty-five, thresholds single out days where activity passes ten million trips - either in that band or fifty to one hundred - to mark </w:t>
+      </w:r>
+      <w:r>
+        <w:lastRenderedPageBreak/>
+        <w:t xml:space="preserve">intense travel periods for clearer visual contrast. On matching dates within shared national coverage, regression links shorter journeys (1–25 miles) pulled from </w:t>
       </w:r>
       <w:proofErr w:type="spellStart"/>
       <w:r>
@@ -1655,7 +1688,6 @@
     </w:p>
     <w:p>
       <w:r>
-        <w:lastRenderedPageBreak/>
         <w:t xml:space="preserve">Typically, RMSE reflects average differences in predicted versus actual trips. What sets R squared apart is its comparison against a baseline that uses only the mean - this distinction clarifies how much variation a model </w:t>
       </w:r>
       <w:proofErr w:type="gramStart"/>
@@ -1679,7 +1711,6 @@
       <w:r>
         <w:t xml:space="preserve"> Data Analysis</w:t>
       </w:r>
-      <w:bookmarkEnd w:id="3"/>
     </w:p>
     <w:p>
       <w:r>
@@ -1748,6 +1779,7 @@
     </w:p>
     <w:p>
       <w:r>
+        <w:lastRenderedPageBreak/>
         <w:t xml:space="preserve">Figure 1 shows weekly </w:t>
       </w:r>
       <w:proofErr w:type="gramStart"/>
@@ -1772,7 +1804,6 @@
         <w:rPr>
           <w:noProof/>
         </w:rPr>
-        <w:lastRenderedPageBreak/>
         <w:drawing>
           <wp:inline distT="0" distB="0" distL="0" distR="0" wp14:anchorId="4FD898CB" wp14:editId="436A7425">
             <wp:extent cx="5486400" cy="2743200"/>
@@ -1889,6 +1920,7 @@
     </w:p>
     <w:p>
       <w:r>
+        <w:lastRenderedPageBreak/>
         <w:t xml:space="preserve">Figure 3 </w:t>
       </w:r>
       <w:proofErr w:type="gramStart"/>
@@ -1897,22 +1929,18 @@
       </w:r>
       <w:proofErr w:type="gramEnd"/>
       <w:r>
-        <w:t xml:space="preserve"> the highest means in short bands, led by Trips 1-3 Miles, consistent with local access trips and short segments within wider journeys. This implies commuting systems still generate massive intra-local circulation, so junction reliability, local transit </w:t>
-      </w:r>
-      <w:r>
-        <w:lastRenderedPageBreak/>
-        <w:t>frequency, and active-travel safety remain high-leverage even when longer commutes exist.</w:t>
+        <w:t xml:space="preserve"> the highest means in short bands, led by Trips 1-3 Miles, consistent with local access trips and short segments within wider journeys. This implies commuting systems still generate massive intra-local circulation, so junction reliability, local transit frequency, and active-travel safety remain high-leverage even when longer commutes exist.</w:t>
       </w:r>
     </w:p>
     <w:p>
       <w:pPr>
         <w:pStyle w:val="Heading1"/>
       </w:pPr>
-      <w:bookmarkStart w:id="4" w:name="_Toc225601595"/>
+      <w:bookmarkStart w:id="3" w:name="_Toc225765972"/>
       <w:r>
         <w:t>Threshold Analysis</w:t>
       </w:r>
-      <w:bookmarkEnd w:id="4"/>
+      <w:bookmarkEnd w:id="3"/>
     </w:p>
     <w:p>
       <w:r>
@@ -1999,11 +2027,11 @@
       <w:pPr>
         <w:pStyle w:val="Heading1"/>
       </w:pPr>
-      <w:bookmarkStart w:id="5" w:name="_Toc225601596"/>
+      <w:bookmarkStart w:id="4" w:name="_Toc225765973"/>
       <w:r>
         <w:t>Regression Model</w:t>
       </w:r>
-      <w:bookmarkEnd w:id="5"/>
+      <w:bookmarkEnd w:id="4"/>
     </w:p>
     <w:p>
       <w:r>
@@ -2012,10 +2040,11 @@
     </w:p>
     <w:p>
       <w:r>
-        <w:t>Figure 5 plots observations with the ordinary least squares line. Linear assumptions include an approximately linear conditional mean and limited outlier leverage; violations can mislead even when fit appears strong.</w:t>
-      </w:r>
-      <w:r>
-        <w:t xml:space="preserve"> Linear regression remains a standard baseline method for interpreting relationships between continuous variables in mobility datasets (James et al., 2021).</w:t>
+        <w:t xml:space="preserve">Figure 5 plots observations with the ordinary least squares line. Linear assumptions include an approximately linear conditional mean and limited outlier leverage; violations </w:t>
+      </w:r>
+      <w:r>
+        <w:lastRenderedPageBreak/>
+        <w:t>can mislead even when fit appears strong. Linear regression remains a standard baseline method for interpreting relationships between continuous variables in mobility datasets (James et al., 2021).</w:t>
       </w:r>
     </w:p>
     <w:p>
@@ -2023,7 +2052,6 @@
         <w:rPr>
           <w:noProof/>
         </w:rPr>
-        <w:lastRenderedPageBreak/>
         <w:drawing>
           <wp:inline distT="0" distB="0" distL="0" distR="0" wp14:anchorId="4ACB72A9" wp14:editId="79FA986E">
             <wp:extent cx="5486400" cy="3291840"/>
@@ -2077,11 +2105,11 @@
       <w:pPr>
         <w:pStyle w:val="Heading1"/>
       </w:pPr>
-      <w:bookmarkStart w:id="6" w:name="_Toc225601597"/>
+      <w:bookmarkStart w:id="5" w:name="_Toc225765974"/>
       <w:r>
         <w:t>Model Evaluation</w:t>
       </w:r>
-      <w:bookmarkEnd w:id="6"/>
+      <w:bookmarkEnd w:id="5"/>
     </w:p>
     <w:p>
       <w:r>
@@ -2134,22 +2162,22 @@
       </w:r>
       <w:proofErr w:type="gramEnd"/>
       <w:r>
-        <w:t xml:space="preserve"> positions the line. Limitations include strict linearity, omitted weekly or shock structure, and sensitivity to merge coverage across Trips_Full Data.csv and Trips_by_Distance.csv.</w:t>
-      </w:r>
-      <w:r>
-        <w:t xml:space="preserve"> Model evaluation using RMSE and R squared supports interpretation of predictive accuracy and explanatory strength in statistical learning pipelines (Pedregosa et al., 2011).</w:t>
+        <w:t xml:space="preserve"> positions the line. Limitations include strict linearity, omitted </w:t>
+      </w:r>
+      <w:r>
+        <w:lastRenderedPageBreak/>
+        <w:t>weekly or shock structure, and sensitivity to merge coverage across Trips_Full Data.csv and Trips_by_Distance.csv. Model evaluation using RMSE and R squared supports interpretation of predictive accuracy and explanatory strength in statistical learning pipelines (Pedregosa et al., 2011).</w:t>
       </w:r>
     </w:p>
     <w:p>
       <w:pPr>
         <w:pStyle w:val="Heading1"/>
       </w:pPr>
-      <w:bookmarkStart w:id="7" w:name="_Toc225601598"/>
-      <w:r>
-        <w:lastRenderedPageBreak/>
+      <w:bookmarkStart w:id="6" w:name="_Toc225765975"/>
+      <w:r>
         <w:t>Travellers by Distance Band</w:t>
       </w:r>
-      <w:bookmarkEnd w:id="7"/>
+      <w:bookmarkEnd w:id="6"/>
     </w:p>
     <w:p>
       <w:r>
@@ -2214,11 +2242,11 @@
       <w:pPr>
         <w:pStyle w:val="Heading1"/>
       </w:pPr>
-      <w:bookmarkStart w:id="8" w:name="_Toc225601599"/>
+      <w:bookmarkStart w:id="7" w:name="_Toc225765976"/>
       <w:r>
         <w:t>Parallel Processing Comparison</w:t>
       </w:r>
-      <w:bookmarkEnd w:id="8"/>
+      <w:bookmarkEnd w:id="7"/>
     </w:p>
     <w:tbl>
       <w:tblPr>
@@ -2322,30 +2350,27 @@
     <w:p/>
     <w:p>
       <w:r>
-        <w:t>The benchmark asks whether partitioned Dask execution accelerates the replicated pipeline relative to serial Pandas on the same logical steps. Sequential runs minimise coordination and keep data movement local to one process. Distributed runs add a scheduler, worker processes, serialization, and partitioned CSV reads—fixed and variable overhead that can dominate elapsed time when partitions are small or when results must be collected frequently to the client.</w:t>
+        <w:t xml:space="preserve">The benchmark asks whether partitioned Dask execution accelerates the replicated pipeline relative to serial Pandas on the same logical steps. Sequential runs minimise coordination and keep data movement local to one process. Distributed runs add a </w:t>
+      </w:r>
+      <w:r>
+        <w:lastRenderedPageBreak/>
+        <w:t>scheduler, worker processes, serialization, and partitioned CSV reads—fixed and variable overhead that can dominate elapsed time when partitions are small or when results must be collected frequently to the client.</w:t>
       </w:r>
     </w:p>
     <w:p>
       <w:r>
-        <w:t xml:space="preserve">Performance scales with size: larger data amortises fixed cluster costs across more bytes and tasks, whereas smaller extracts spend disproportionate time on graph construction </w:t>
-      </w:r>
-      <w:r>
-        <w:lastRenderedPageBreak/>
-        <w:t>and startup. Dask is more compelling for large, repeated partitioned pipelines and when out-of-core execution avoids memory ceilings. In the recorded coursework run, serial time was 3.99 seconds versus 9.06 seconds with ten workers and 9.58 seconds with twenty workers, illustrating coordination overhead under the tested configuration and moderate data scale.</w:t>
-      </w:r>
-      <w:r>
-        <w:t xml:space="preserve"> Parallel execution performance depends strongly on dataset size partitioning overhead and scheduler coordination costs (Rocklin, 2015).</w:t>
+        <w:t>Performance scales with size: larger data amortises fixed cluster costs across more bytes and tasks, whereas smaller extracts spend disproportionate time on graph construction and startup. Dask is more compelling for large, repeated partitioned pipelines and when out-of-core execution avoids memory ceilings. In the recorded coursework run, serial time was 3.99 seconds versus 9.06 seconds with ten workers and 9.58 seconds with twenty workers, illustrating coordination overhead under the tested configuration and moderate data scale. Parallel execution performance depends strongly on dataset size partitioning overhead and scheduler coordination costs (Rocklin, 2015).</w:t>
       </w:r>
     </w:p>
     <w:p>
       <w:pPr>
         <w:pStyle w:val="Heading1"/>
       </w:pPr>
-      <w:bookmarkStart w:id="9" w:name="_Toc225601600"/>
+      <w:bookmarkStart w:id="8" w:name="_Toc225765977"/>
       <w:r>
         <w:t>Discussion</w:t>
       </w:r>
-      <w:bookmarkEnd w:id="9"/>
+      <w:bookmarkEnd w:id="8"/>
     </w:p>
     <w:p>
       <w:r>
@@ -2356,11 +2381,11 @@
       <w:pPr>
         <w:pStyle w:val="Heading1"/>
       </w:pPr>
-      <w:bookmarkStart w:id="10" w:name="_Toc225601601"/>
+      <w:bookmarkStart w:id="9" w:name="_Toc225765978"/>
       <w:r>
         <w:t>Limitations</w:t>
       </w:r>
-      <w:bookmarkEnd w:id="10"/>
+      <w:bookmarkEnd w:id="9"/>
     </w:p>
     <w:p>
       <w:pPr>
@@ -2369,7 +2394,6 @@
           <w:bCs/>
         </w:rPr>
       </w:pPr>
-      <w:bookmarkStart w:id="11" w:name="_Toc225601602"/>
       <w:r>
         <w:t>Hidden differences between regions vanish when data are pooled nationally. Because seasons overlap with holidays, policies, and long-term shifts, patterns can blur together. Trends that assume straight-line change might ignore sudden breaks or shifting phases in movement behavior. Timing analyses using modest sample sizes gain little from parallel processing since overhead eats into gains. Missing factors - like fuel prices, climate swings, or job market disruptions - weaken cause-effect claims. Unaccounted forces still shape what remains after modeling.</w:t>
       </w:r>
@@ -2381,10 +2405,11 @@
       <w:pPr>
         <w:pStyle w:val="Heading1"/>
       </w:pPr>
+      <w:bookmarkStart w:id="10" w:name="_Toc225765979"/>
       <w:r>
         <w:t>Conclusion</w:t>
       </w:r>
-      <w:bookmarkEnd w:id="11"/>
+      <w:bookmarkEnd w:id="10"/>
     </w:p>
     <w:p>
       <w:r>
@@ -2396,25 +2421,56 @@
       </w:r>
       <w:proofErr w:type="spellEnd"/>
       <w:r>
-        <w:t xml:space="preserve"> Data.csv jointly portray weekly home and non-home behaviour, short-band dominance, and medium-distance high-volume days. Regression links Trips 1-25 Miles to Number of Trips 5-10 with R2 equal to 0.946 and RMSE equal to 1981454.86. Serial Pandas outpaced Dask with ten and twenty workers in the recorded benchmark, consistent with coordination overhead. Future work may add geography, seasonality, nonlinear models, larger extracts to retest parallelism, and policy covariates.</w:t>
+        <w:t xml:space="preserve"> Data.csv jointly portray weekly home and non-home behaviour, short-band dominance, and medium-distance high-volume days. Regression links Trips 1-25 Miles to Number of Trips 5-10 with R2 equal to 0.946 and RMSE equal to 1981454.86. Serial Pandas outpaced Dask with ten and twenty workers in the recorded benchmark, consistent with coordination overhead. Future work may add </w:t>
+      </w:r>
+      <w:r>
+        <w:lastRenderedPageBreak/>
+        <w:t>geography, seasonality, nonlinear models, larger extracts to retest parallelism, and policy covariates.</w:t>
       </w:r>
     </w:p>
     <w:p>
       <w:pPr>
         <w:pStyle w:val="Heading1"/>
       </w:pPr>
+      <w:bookmarkStart w:id="11" w:name="_Toc225765980"/>
       <w:r>
         <w:t>References</w:t>
       </w:r>
+      <w:bookmarkEnd w:id="11"/>
     </w:p>
     <w:p>
       <w:r>
-        <w:t>Bureau of Transportation Statistics. (2024). Trips by distance dataset. https://data.bts.gov</w:t>
+        <w:t>Bureau of Transportation Statistics. (2024). Trips by distance dataset.</w:t>
+      </w:r>
+      <w:r>
+        <w:t xml:space="preserve"> </w:t>
+      </w:r>
+      <w:hyperlink r:id="rId14" w:history="1">
+        <w:r>
+          <w:rPr>
+            <w:rStyle w:val="Hyperlink"/>
+          </w:rPr>
+          <w:t>https://data.bts.gov</w:t>
+        </w:r>
+      </w:hyperlink>
+      <w:r>
+        <w:tab/>
       </w:r>
     </w:p>
     <w:p>
       <w:r>
-        <w:t>Dask Development Team. (2024). Dask documentation. https://docs.dask.org</w:t>
+        <w:t xml:space="preserve">Dask Development Team. (2024). Dask documentation. </w:t>
+      </w:r>
+      <w:hyperlink r:id="rId15" w:history="1">
+        <w:r>
+          <w:rPr>
+            <w:rStyle w:val="Hyperlink"/>
+          </w:rPr>
+          <w:t>https://docs.dask.org</w:t>
+        </w:r>
+      </w:hyperlink>
+      <w:r>
+        <w:tab/>
       </w:r>
     </w:p>
     <w:p>
@@ -2446,27 +2502,17 @@
       <w:r>
         <w:br w:type="page"/>
       </w:r>
-    </w:p>
-    <w:p>
-      <w:pPr>
-        <w:pStyle w:val="Heading1"/>
-      </w:pPr>
-      <w:bookmarkStart w:id="12" w:name="_Toc225601603"/>
-      <w:r>
-        <w:lastRenderedPageBreak/>
-        <w:t>Appendix</w:t>
-      </w:r>
-      <w:bookmarkEnd w:id="12"/>
     </w:p>
     <w:p>
       <w:pPr>
         <w:pStyle w:val="Heading2"/>
       </w:pPr>
-      <w:bookmarkStart w:id="13" w:name="_Toc225601605"/>
-      <w:r>
+      <w:bookmarkStart w:id="12" w:name="_Toc225765981"/>
+      <w:r>
+        <w:lastRenderedPageBreak/>
         <w:t>Pseudocode</w:t>
       </w:r>
-      <w:bookmarkEnd w:id="13"/>
+      <w:bookmarkEnd w:id="12"/>
     </w:p>
     <w:p>
       <w:r>
@@ -2617,13 +2663,13 @@
       </w:r>
       <w:r>
         <w:br/>
+        <w:t>19. Run the workflow in serial mode.</w:t>
+      </w:r>
+      <w:r>
+        <w:br/>
       </w:r>
       <w:r>
         <w:lastRenderedPageBreak/>
-        <w:t>19. Run the workflow in serial mode.</w:t>
-      </w:r>
-      <w:r>
-        <w:br/>
         <w:t>20. Record the serial execution time.</w:t>
       </w:r>
       <w:r>
@@ -2659,11 +2705,11 @@
       <w:pPr>
         <w:pStyle w:val="Heading2"/>
       </w:pPr>
-      <w:bookmarkStart w:id="14" w:name="_Toc225601606"/>
+      <w:bookmarkStart w:id="13" w:name="_Toc225765982"/>
       <w:r>
         <w:t>Flowchart description</w:t>
       </w:r>
-      <w:bookmarkEnd w:id="14"/>
+      <w:bookmarkEnd w:id="13"/>
     </w:p>
     <w:p>
       <w:r>
@@ -2673,100 +2719,199 @@
     <w:p>
       <w:r>
         <w:t>Start</w:t>
+      </w:r>
+      <w:r>
         <w:br/>
         <w:t>↓</w:t>
+      </w:r>
+      <w:r>
         <w:br/>
         <w:t>Load Trips_by_Distance.csv and Trips_Full Data.csv</w:t>
+      </w:r>
+      <w:r>
         <w:br/>
         <w:t>↓</w:t>
+      </w:r>
+      <w:r>
         <w:br/>
         <w:t>Convert Date fields</w:t>
+      </w:r>
+      <w:r>
         <w:br/>
         <w:t>↓</w:t>
+      </w:r>
+      <w:r>
         <w:br/>
         <w:t>Filter National level rows</w:t>
+      </w:r>
+      <w:r>
         <w:br/>
         <w:t>↓</w:t>
+      </w:r>
+      <w:r>
         <w:br/>
         <w:t>Clean and remove irrelevant columns</w:t>
+      </w:r>
+      <w:r>
         <w:br/>
         <w:t>↓</w:t>
+      </w:r>
+      <w:r>
         <w:br/>
         <w:t>Question 1:</w:t>
+      </w:r>
+      <w:r>
         <w:br/>
         <w:t>Compute weekly home and non-home averages</w:t>
+      </w:r>
+      <w:r>
         <w:br/>
         <w:t>↓</w:t>
+      </w:r>
+      <w:r>
         <w:br/>
         <w:t>Create weekly bar charts</w:t>
+      </w:r>
+      <w:r>
         <w:br/>
         <w:t>↓</w:t>
+      </w:r>
+      <w:r>
         <w:br/>
         <w:t>Question 2:</w:t>
+      </w:r>
+      <w:r>
         <w:br/>
         <w:t>Filter dates above 10,000,000 for 10-25 and 50-100 trip ranges</w:t>
+      </w:r>
+      <w:r>
         <w:br/>
         <w:t>↓</w:t>
+      </w:r>
+      <w:r>
         <w:br/>
         <w:t>Create threshold comparison scatter plot</w:t>
+      </w:r>
+      <w:r>
         <w:br/>
         <w:t>↓</w:t>
+      </w:r>
+      <w:r>
         <w:br/>
         <w:t>Question 3:</w:t>
+      </w:r>
+      <w:r>
         <w:br/>
         <w:t>Align dates and train linear regression model</w:t>
+      </w:r>
+      <w:r>
         <w:br/>
         <w:t>↓</w:t>
+      </w:r>
+      <w:r>
         <w:br/>
         <w:t>Evaluate RMSE and R2</w:t>
+      </w:r>
+      <w:r>
         <w:br/>
         <w:t>↓</w:t>
+      </w:r>
+      <w:r>
         <w:br/>
         <w:t>Create regression figure</w:t>
+      </w:r>
+      <w:r>
         <w:br/>
         <w:t>↓</w:t>
+      </w:r>
+      <w:r>
         <w:br/>
         <w:t>Question 4:</w:t>
+      </w:r>
+      <w:r>
         <w:br/>
         <w:t>Compute average travellers by distance category</w:t>
+      </w:r>
+      <w:r>
+        <w:br/>
+      </w:r>
+      <w:r>
+        <w:lastRenderedPageBreak/>
+        <w:t>↓</w:t>
+      </w:r>
+      <w:r>
+        <w:br/>
+        <w:t>Create distance-trip bar chart</w:t>
+      </w:r>
+      <w:r>
         <w:br/>
         <w:t>↓</w:t>
+      </w:r>
+      <w:r>
         <w:br/>
-        <w:t>Create distance-trip bar chart</w:t>
+        <w:t>Run serial workflow</w:t>
+      </w:r>
+      <w:r>
         <w:br/>
         <w:t>↓</w:t>
+      </w:r>
+      <w:r>
         <w:br/>
-        <w:t>Run serial workflow</w:t>
+        <w:t>Record time</w:t>
+      </w:r>
+      <w:r>
         <w:br/>
         <w:t>↓</w:t>
+      </w:r>
+      <w:r>
+        <w:br/>
+        <w:t>Run parallel workflow with 10 workers</w:t>
+      </w:r>
+      <w:r>
+        <w:br/>
+        <w:t>↓</w:t>
+      </w:r>
+      <w:r>
         <w:br/>
         <w:t>Record time</w:t>
+      </w:r>
+      <w:r>
         <w:br/>
         <w:t>↓</w:t>
+      </w:r>
+      <w:r>
         <w:br/>
-        <w:t>Run parallel workflow with 10 workers</w:t>
+        <w:t>Run parallel workflow with 20 workers</w:t>
+      </w:r>
+      <w:r>
         <w:br/>
         <w:t>↓</w:t>
+      </w:r>
+      <w:r>
         <w:br/>
         <w:t>Record time</w:t>
+      </w:r>
+      <w:r>
         <w:br/>
         <w:t>↓</w:t>
+      </w:r>
+      <w:r>
         <w:br/>
-        <w:t>Run parallel workflow with 20 workers</w:t>
+        <w:t>Create timing comparison table</w:t>
+      </w:r>
+      <w:r>
         <w:br/>
         <w:t>↓</w:t>
+      </w:r>
+      <w:r>
         <w:br/>
-        <w:t>Record time</w:t>
+        <w:t>Insert outputs into the report</w:t>
+      </w:r>
+      <w:r>
         <w:br/>
         <w:t>↓</w:t>
-        <w:br/>
-        <w:t>Create timing comparison table</w:t>
-        <w:br/>
-        <w:t>↓</w:t>
-        <w:br/>
-        <w:t>Insert outputs into the report</w:t>
-        <w:br/>
-        <w:t>↓</w:t>
+      </w:r>
+      <w:r>
         <w:br/>
         <w:t>End</w:t>
       </w:r>
@@ -2776,9 +2921,11 @@
       <w:pPr>
         <w:pStyle w:val="Heading1"/>
       </w:pPr>
+      <w:bookmarkStart w:id="14" w:name="_Toc225765983"/>
       <w:r>
         <w:t>GitHub Link</w:t>
       </w:r>
+      <w:bookmarkEnd w:id="14"/>
     </w:p>
     <w:p>
       <w:pPr>
@@ -2787,7 +2934,7 @@
           <w:szCs w:val="32"/>
         </w:rPr>
       </w:pPr>
-      <w:hyperlink r:id="rId14" w:history="1">
+      <w:hyperlink r:id="rId16" w:history="1">
         <w:r>
           <w:rPr>
             <w:rStyle w:val="Hyperlink"/>

</xml_diff>